<commit_message>
Growth: Wise revisada con el 2T FY27; sigue Mantener (+4,0 %)
Co-Authored-By: Claude Opus 5.5 (1M context) <noreply@anthropic.com>
Claude-Session: https://claude.ai/code/session_01JDm5vWiBcw9E9BcFQ2kMdJ
</commit_message>
<xml_diff>
--- a/informes-growth/wise-2026-10-14/Wise - growth - 2026-10-14.docx
+++ b/informes-growth/wise-2026-10-14/Wise - growth - 2026-10-14.docx
@@ -2,7 +2,7 @@
 <file path=word/document.xml><?xml version="1.0" encoding="utf-8"?>
 <w:document xmlns:w="http://schemas.openxmlformats.org/wordprocessingml/2006/main" xmlns:m="http://schemas.openxmlformats.org/officeDocument/2006/math" xmlns:r="http://schemas.openxmlformats.org/officeDocument/2006/relationships" xmlns:o="urn:schemas-microsoft-com:office:office" xmlns:v="urn:schemas-microsoft-com:vml" xmlns:w10="urn:schemas-microsoft-com:office:word" xmlns:a="http://schemas.openxmlformats.org/drawingml/2006/main" xmlns:pic="http://schemas.openxmlformats.org/drawingml/2006/picture" xmlns:wp="http://schemas.openxmlformats.org/drawingml/2006/wordprocessingDrawing">
   <w:body>
-    <w:bookmarkStart w:id="35" w:name="wise-wse-análisis-growth-14-oct-2026"/>
+    <w:bookmarkStart w:id="36" w:name="wise-wse-análisis-growth-14-oct-2026"/>
     <w:p>
       <w:pPr>
         <w:pStyle w:val="Heading1"/>
@@ -32,7 +32,7 @@
         <w:t xml:space="preserve"> </w:t>
       </w:r>
       <w:r>
-        <w:t xml:space="preserve">Precio 12,22 USD (fecha del informe) · Objetivo 12 m 12,7 USD · Ponderada +3,9 % · Base +4,5 % · Bajista −38,9 % · Alcista +44,8 % · Compra hasta 12,1 USD</w:t>
+        <w:t xml:space="preserve">Precio 12,21 USD (15-oct, fuera de hora tras los resultados) · Objetivo 12 m 12,7 USD · Ponderada +4,0 % · Base +4,6 % · Bajista −38,6 % · Compra hasta 12,1 USD</w:t>
       </w:r>
       <w:r>
         <w:t xml:space="preserve"> </w:t>
@@ -45,6 +45,52 @@
       </w:r>
       <w:r>
         <w:t xml:space="preserve">Cabecera rehecha con la v11 el 15-oct (auditoría de homogeneidad). Antes decía (método v7): Comprar (convicción baja). El texto de abajo puede citar cifras de esa versión anterior; mandan las de esta cabecera.</w:t>
+      </w:r>
+      <w:r>
+        <w:t xml:space="preserve"> </w:t>
+      </w:r>
+      <w:r>
+        <w:rPr>
+          <w:bCs/>
+          <w:b/>
+        </w:rPr>
+        <w:t xml:space="preserve">Revisión con el 2T FY27 (15-oct, tras el cierre de EE. UU.):</w:t>
+      </w:r>
+      <w:r>
+        <w:t xml:space="preserve"> </w:t>
+      </w:r>
+      <w:r>
+        <w:t xml:space="preserve">ingresos netos 739,1 M USD (+21 %, también a tipo constante; el trimestre anterior +24,5 %), volumen +22 %, clientes activos 12,5 M (+20 %), comisión media 49 pb (−3 pb). Sube la guía del año a la mitad alta del 15-20 % y mantiene el margen antes de impuestos en lo alto del 20-25 %. Con la v11 sigue en</w:t>
+      </w:r>
+      <w:r>
+        <w:t xml:space="preserve"> </w:t>
+      </w:r>
+      <w:r>
+        <w:rPr>
+          <w:bCs/>
+          <w:b/>
+        </w:rPr>
+        <w:t xml:space="preserve">Mantener</w:t>
+      </w:r>
+      <w:r>
+        <w:t xml:space="preserve"> </w:t>
+      </w:r>
+      <w:r>
+        <w:t xml:space="preserve">(ponderada +4,0 %, compra hasta 12,1 USD): el crecimiento se frena algo y el precio apenas se mueve. No entra como suplente. Fuente:</w:t>
+      </w:r>
+      <w:r>
+        <w:t xml:space="preserve"> </w:t>
+      </w:r>
+      <w:hyperlink r:id="rId20">
+        <w:r>
+          <w:rPr>
+            <w:rStyle w:val="Hyperlink"/>
+          </w:rPr>
+          <w:t xml:space="preserve">Wise, resultados del 2T FY27</w:t>
+        </w:r>
+      </w:hyperlink>
+      <w:r>
+        <w:t xml:space="preserve">.</w:t>
       </w:r>
     </w:p>
     <w:p>
@@ -202,7 +248,7 @@
         <w:t xml:space="preserve">: el bono de 250 M GBP (335 M USD con la deuda a corto).</w:t>
       </w:r>
     </w:p>
-    <w:bookmarkStart w:id="20" w:name="la-tesis-en-cinco-líneas"/>
+    <w:bookmarkStart w:id="21" w:name="la-tesis-en-cinco-líneas"/>
     <w:p>
       <w:pPr>
         <w:pStyle w:val="Heading2"/>
@@ -355,8 +401,8 @@
         <w:t xml:space="preserve">. Se revisa tras los resultados del 1S (12-nov) con un límite de 12,5 USD.</w:t>
       </w:r>
     </w:p>
-    <w:bookmarkEnd w:id="20"/>
-    <w:bookmarkStart w:id="21" w:name="negocio-y-tecnología"/>
+    <w:bookmarkEnd w:id="21"/>
+    <w:bookmarkStart w:id="22" w:name="negocio-y-tecnología"/>
     <w:p>
       <w:pPr>
         <w:pStyle w:val="Heading2"/>
@@ -521,8 +567,8 @@
         <w:t xml:space="preserve">: es líder entre los especialistas digitales (Remitly, Revolut, PayPal/Xoom), pero los bancos siguen moviendo la mayor parte del volumen de personas y pymes.</w:t>
       </w:r>
     </w:p>
-    <w:bookmarkEnd w:id="21"/>
-    <w:bookmarkStart w:id="22" w:name="crecimiento"/>
+    <w:bookmarkEnd w:id="22"/>
+    <w:bookmarkStart w:id="23" w:name="crecimiento"/>
     <w:p>
       <w:pPr>
         <w:pStyle w:val="Heading2"/>
@@ -1468,8 +1514,8 @@
         <w:t xml:space="preserve">: ingresos netos +15-20 % a tipo constante, «en torno a la mitad», y margen antes de impuestos «en lo alto del 20-25 %». Supone que no cambian los tipos ni lo que se paga a clientes [1][2].</w:t>
       </w:r>
     </w:p>
-    <w:bookmarkEnd w:id="22"/>
-    <w:bookmarkStart w:id="23" w:name="mercado-y-competencia"/>
+    <w:bookmarkEnd w:id="23"/>
+    <w:bookmarkStart w:id="24" w:name="mercado-y-competencia"/>
     <w:p>
       <w:pPr>
         <w:pStyle w:val="Heading2"/>
@@ -1586,8 +1632,8 @@
         <w:t xml:space="preserve">(ley GENIUS en EE. UU.) y los enlaces directos entre sistemas de pago instantáneo pueden abaratar la transferencia internacional para todos. Wise quiere ser la capa que conecta esos raíles: de ahí su nueva solicitud de licencia en EE. UU. [4].</w:t>
       </w:r>
     </w:p>
-    <w:bookmarkEnd w:id="23"/>
-    <w:bookmarkStart w:id="24" w:name="cambio-de-tendencia"/>
+    <w:bookmarkEnd w:id="24"/>
+    <w:bookmarkStart w:id="25" w:name="cambio-de-tendencia"/>
     <w:p>
       <w:pPr>
         <w:pStyle w:val="Heading2"/>
@@ -2190,8 +2236,8 @@
         <w:t xml:space="preserve">La acción cae un 6,5 % en 12 meses (984,5 p → 920,4 p) y el EV/beneficio bruto es de 4,3x.</w:t>
       </w:r>
     </w:p>
-    <w:bookmarkEnd w:id="24"/>
-    <w:bookmarkStart w:id="25" w:name="X6a3ced9ea5ed5bb9ac58f5e7c1bb09ad4718b77"/>
+    <w:bookmarkEnd w:id="25"/>
+    <w:bookmarkStart w:id="26" w:name="X6a3ced9ea5ed5bb9ac58f5e7c1bb09ad4718b77"/>
     <w:p>
       <w:pPr>
         <w:pStyle w:val="Heading2"/>
@@ -2324,8 +2370,8 @@
         <w:t xml:space="preserve">: la rentabilidad media de los saldos bajó del 3,9 % al 3,0 % en el FY26. Con 31.000 M de saldos, cada punto menos de tipos son ~300 M de ingresos brutos, ~165 M netos si Wise devuelve un 45 %.</w:t>
       </w:r>
     </w:p>
-    <w:bookmarkEnd w:id="25"/>
-    <w:bookmarkStart w:id="26" w:name="caja-deuda-y-dilución"/>
+    <w:bookmarkEnd w:id="26"/>
+    <w:bookmarkStart w:id="27" w:name="caja-deuda-y-dilución"/>
     <w:p>
       <w:pPr>
         <w:pStyle w:val="Heading2"/>
@@ -2454,8 +2500,8 @@
         <w:t xml:space="preserve">: hay acciones clase B solo de voto, y los votos del fundador tienen un tope de un voto por debajo del 50 % [7].</w:t>
       </w:r>
     </w:p>
-    <w:bookmarkEnd w:id="26"/>
-    <w:bookmarkStart w:id="27" w:name="dirección-y-ejecución"/>
+    <w:bookmarkEnd w:id="27"/>
+    <w:bookmarkStart w:id="28" w:name="dirección-y-ejecución"/>
     <w:p>
       <w:pPr>
         <w:pStyle w:val="Heading2"/>
@@ -2502,8 +2548,8 @@
         <w:t xml:space="preserve">: el cofundador Kristo Käärmann es CEO y tiene el 18,2 % de la clase A [7]. La asignación de capital es sensata (recompras con FCF, sin adquisiciones caras). Le restan los fallos de cumplimiento normativo, que ya son un patrón: orden de consentimiento de varios estados de EE. UU. (jul-2025), investigación de la fiscalía de Bruselas (jun-2026) y rechazo de la OCC por «deficiencias» contra el blanqueo (jul-2026) [4][5]. También el coste y las ventas de directivos. Barak Eilam (ex-CEO de NICE) será presidente desde abril de 2027 [15].</w:t>
       </w:r>
     </w:p>
-    <w:bookmarkEnd w:id="27"/>
-    <w:bookmarkStart w:id="28" w:name="valoración"/>
+    <w:bookmarkEnd w:id="28"/>
+    <w:bookmarkStart w:id="29" w:name="valoración"/>
     <w:p>
       <w:pPr>
         <w:pStyle w:val="Heading2"/>
@@ -3151,8 +3197,8 @@
         <w:t xml:space="preserve">(~5,8 % con FCF sin sumar los pagos en acciones). Muy por debajo del 15-20 % que la empresa espera a medio plazo. Es barata si el negocio no se rompe por la regulación o por los tipos.</w:t>
       </w:r>
     </w:p>
-    <w:bookmarkEnd w:id="28"/>
-    <w:bookmarkStart w:id="29" w:name="foros-y-sentimiento"/>
+    <w:bookmarkEnd w:id="29"/>
+    <w:bookmarkStart w:id="30" w:name="foros-y-sentimiento"/>
     <w:p>
       <w:pPr>
         <w:pStyle w:val="Heading2"/>
@@ -3285,8 +3331,8 @@
         <w:t xml:space="preserve">: el sentimiento es peor que el negocio, que acelera (volumen +26 %, saldos +31 %) mientras la acción está en el múltiplo más bajo de 3 años. Es el perfil de un posible giro de percepción, pero aún sin señales que lo confirmen. Si las investigaciones acaban en multa o en límites a la actividad en la UE, el mercado tendría razón.</w:t>
       </w:r>
     </w:p>
-    <w:bookmarkEnd w:id="29"/>
-    <w:bookmarkStart w:id="30" w:name="riesgos-y-qué-rompería-la-tesis"/>
+    <w:bookmarkEnd w:id="30"/>
+    <w:bookmarkStart w:id="31" w:name="riesgos-y-qué-rompería-la-tesis"/>
     <w:p>
       <w:pPr>
         <w:pStyle w:val="Heading2"/>
@@ -3453,8 +3499,8 @@
         <w:t xml:space="preserve">Hoy no hay tesis rota.</w:t>
       </w:r>
     </w:p>
-    <w:bookmarkEnd w:id="30"/>
-    <w:bookmarkStart w:id="31" w:name="catalizadores-con-fecha"/>
+    <w:bookmarkEnd w:id="31"/>
+    <w:bookmarkStart w:id="32" w:name="catalizadores-con-fecha"/>
     <w:p>
       <w:pPr>
         <w:pStyle w:val="Heading2"/>
@@ -3745,8 +3791,8 @@
         </w:tc>
       </w:tr>
     </w:tbl>
-    <w:bookmarkEnd w:id="31"/>
-    <w:bookmarkStart w:id="32" w:name="encaje-en-cartera"/>
+    <w:bookmarkEnd w:id="32"/>
+    <w:bookmarkStart w:id="33" w:name="encaje-en-cartera"/>
     <w:p>
       <w:pPr>
         <w:pStyle w:val="Heading2"/>
@@ -3958,8 +4004,8 @@
         <w:t xml:space="preserve">: no solapa con nada de la cartera value. Con Nu y Shopify sí comparte factor «fintech/pagos», y añade exposición a los tipos de interés (como Nu). No es juego ni comercio minorista.</w:t>
       </w:r>
     </w:p>
-    <w:bookmarkEnd w:id="32"/>
-    <w:bookmarkStart w:id="33" w:name="puntuación"/>
+    <w:bookmarkEnd w:id="33"/>
+    <w:bookmarkStart w:id="34" w:name="puntuación"/>
     <w:p>
       <w:pPr>
         <w:pStyle w:val="Heading2"/>
@@ -4519,8 +4565,8 @@
         <w:t xml:space="preserve">: incluir entre los supuestos de §2.5 una investigación penal o de un supervisor sobre el negocio principal (blanqueo, licencias). Hoy depende del criterio del analista y cambia la señal de Wise.</w:t>
       </w:r>
     </w:p>
-    <w:bookmarkEnd w:id="33"/>
-    <w:bookmarkStart w:id="34" w:name="fuentes"/>
+    <w:bookmarkEnd w:id="34"/>
+    <w:bookmarkStart w:id="35" w:name="fuentes"/>
     <w:p>
       <w:pPr>
         <w:pStyle w:val="Heading2"/>
@@ -4640,8 +4686,8 @@
         <w:t xml:space="preserve">: acciones, caja e ingresos de los comparables (múltiplos aproximados con sus precios del 14-oct de Yahoo), y el mercado alcanzable (estimación propia).</w:t>
       </w:r>
     </w:p>
-    <w:bookmarkEnd w:id="34"/>
     <w:bookmarkEnd w:id="35"/>
+    <w:bookmarkEnd w:id="36"/>
     <w:sectPr/>
   </w:body>
 </w:document>

</xml_diff>